<commit_message>
Finished the main task, but haven't made the text file for it
</commit_message>
<xml_diff>
--- a/ListSummatorAsync/text.docx
+++ b/ListSummatorAsync/text.docx
@@ -7,6 +7,8 @@
         <w:jc w:val="right"/>
         <w:rPr>
           <w:rFonts w:ascii="Times New Roman" w:hAnsi="Times New Roman" w:cs="Times New Roman"/>
+          <w:sz w:val="26"/>
+          <w:szCs w:val="26"/>
         </w:rPr>
       </w:pPr>
       <w:r>
@@ -17,23 +19,70 @@
           <w:sz w:val="26"/>
           <w:szCs w:val="26"/>
         </w:rPr>
-        <w:t>Осипов</w:t>
+        <w:t xml:space="preserve">Осипов Михаил, группа 20250. ДЗ по </w:t>
       </w:r>
       <w:r>
         <w:rPr>
           <w:rFonts w:ascii="Times New Roman" w:hAnsi="Times New Roman" w:cs="Times New Roman"/>
           <w:b/>
           <w:bCs/>
-        </w:rPr>
-        <w:t xml:space="preserve"> Михаил, группа 20250. ДЗ по ООП от 05.03.2026</w:t>
-      </w:r>
-    </w:p>
-    <w:p>
-      <w:pPr>
-        <w:rPr>
-          <w:rFonts w:ascii="Times New Roman" w:hAnsi="Times New Roman" w:cs="Times New Roman"/>
-        </w:rPr>
-      </w:pPr>
+          <w:sz w:val="26"/>
+          <w:szCs w:val="26"/>
+        </w:rPr>
+        <w:t>ОС</w:t>
+      </w:r>
+      <w:r>
+        <w:rPr>
+          <w:rFonts w:ascii="Times New Roman" w:hAnsi="Times New Roman" w:cs="Times New Roman"/>
+          <w:b/>
+          <w:bCs/>
+          <w:sz w:val="26"/>
+          <w:szCs w:val="26"/>
+        </w:rPr>
+        <w:t xml:space="preserve"> от </w:t>
+      </w:r>
+      <w:r>
+        <w:rPr>
+          <w:rFonts w:ascii="Times New Roman" w:hAnsi="Times New Roman" w:cs="Times New Roman"/>
+          <w:b/>
+          <w:bCs/>
+          <w:sz w:val="26"/>
+          <w:szCs w:val="26"/>
+          <w:lang w:val="en-US"/>
+        </w:rPr>
+        <w:t>16.</w:t>
+      </w:r>
+      <w:r>
+        <w:rPr>
+          <w:rFonts w:ascii="Times New Roman" w:hAnsi="Times New Roman" w:cs="Times New Roman"/>
+          <w:b/>
+          <w:bCs/>
+          <w:sz w:val="26"/>
+          <w:szCs w:val="26"/>
+        </w:rPr>
+        <w:t>0</w:t>
+      </w:r>
+      <w:r>
+        <w:rPr>
+          <w:rFonts w:ascii="Times New Roman" w:hAnsi="Times New Roman" w:cs="Times New Roman"/>
+          <w:b/>
+          <w:bCs/>
+          <w:sz w:val="26"/>
+          <w:szCs w:val="26"/>
+          <w:lang w:val="en-US"/>
+        </w:rPr>
+        <w:t>4</w:t>
+      </w:r>
+      <w:r>
+        <w:rPr>
+          <w:rFonts w:ascii="Times New Roman" w:hAnsi="Times New Roman" w:cs="Times New Roman"/>
+          <w:b/>
+          <w:bCs/>
+          <w:sz w:val="26"/>
+          <w:szCs w:val="26"/>
+        </w:rPr>
+        <w:t>.2026</w:t>
+      </w:r>
     </w:p>
     <w:p>
       <w:pPr>
@@ -772,7 +821,6 @@
         <w:rPr>
           <w:rFonts w:ascii="Times New Roman" w:hAnsi="Times New Roman" w:cs="Times New Roman"/>
         </w:rPr>
-        <w:lastRenderedPageBreak/>
         <w:t xml:space="preserve">Program — запускает </w:t>
       </w:r>
       <w:proofErr w:type="spellStart"/>
@@ -2348,7 +2396,6 @@
           <w:szCs w:val="16"/>
           <w:lang w:val="en-US"/>
         </w:rPr>
-        <w:lastRenderedPageBreak/>
         <w:t>using</w:t>
       </w:r>
       <w:r>
@@ -2398,6 +2445,7 @@
           <w:szCs w:val="16"/>
           <w:lang w:val="en-US"/>
         </w:rPr>
+        <w:lastRenderedPageBreak/>
         <w:t>using</w:t>
       </w:r>
       <w:r>
@@ -5125,6 +5173,7 @@
           <w:color w:val="000000"/>
           <w:sz w:val="16"/>
           <w:szCs w:val="16"/>
+          <w:lang w:val="en-US"/>
         </w:rPr>
       </w:pPr>
       <w:r>
@@ -5143,6 +5192,7 @@
           <w:color w:val="000000"/>
           <w:sz w:val="16"/>
           <w:szCs w:val="16"/>
+          <w:lang w:val="en-US"/>
         </w:rPr>
         <w:t>}</w:t>
       </w:r>
@@ -5172,14 +5222,16 @@
           <w:color w:val="000000"/>
           <w:sz w:val="16"/>
           <w:szCs w:val="16"/>
-        </w:rPr>
-      </w:pPr>
-      <w:r>
-        <w:rPr>
-          <w:rFonts w:ascii="Cascadia Mono" w:eastAsia="Times New Roman" w:hAnsi="Cascadia Mono" w:cs="Courier New"/>
-          <w:color w:val="000000"/>
-          <w:sz w:val="16"/>
-          <w:szCs w:val="16"/>
+          <w:lang w:val="en-US"/>
+        </w:rPr>
+      </w:pPr>
+      <w:r>
+        <w:rPr>
+          <w:rFonts w:ascii="Cascadia Mono" w:eastAsia="Times New Roman" w:hAnsi="Cascadia Mono" w:cs="Courier New"/>
+          <w:color w:val="000000"/>
+          <w:sz w:val="16"/>
+          <w:szCs w:val="16"/>
+          <w:lang w:val="en-US"/>
         </w:rPr>
         <w:t xml:space="preserve">    }</w:t>
       </w:r>
@@ -5218,6 +5270,7 @@
           <w:color w:val="000000"/>
           <w:sz w:val="16"/>
           <w:szCs w:val="16"/>
+          <w:lang w:val="en-US"/>
         </w:rPr>
         <w:t>}</w:t>
       </w:r>
@@ -9590,7 +9643,6 @@
           <w:sz w:val="16"/>
           <w:szCs w:val="16"/>
         </w:rPr>
-        <w:lastRenderedPageBreak/>
         <w:t xml:space="preserve">    }</w:t>
       </w:r>
     </w:p>
@@ -9628,6 +9680,7 @@
           <w:sz w:val="16"/>
           <w:szCs w:val="16"/>
         </w:rPr>
+        <w:lastRenderedPageBreak/>
         <w:t>}</w:t>
       </w:r>
     </w:p>
@@ -10287,6 +10340,7 @@
   <w:style w:type="character" w:default="1" w:styleId="DefaultParagraphFont">
     <w:name w:val="Default Paragraph Font"/>
     <w:uiPriority w:val="1"/>
+    <w:semiHidden/>
     <w:unhideWhenUsed/>
   </w:style>
   <w:style w:type="table" w:default="1" w:styleId="TableNormal">

</xml_diff>